<commit_message>
fix app to report
</commit_message>
<xml_diff>
--- a/Задание 3.docx
+++ b/Задание 3.docx
@@ -1,6 +1,6 @@
 
 <file path=word/document.xml><?xml version="1.0" encoding="utf-8"?>
-<w:document xmlns:wpc="http://schemas.microsoft.com/office/word/2010/wordprocessingCanvas" xmlns:cx="http://schemas.microsoft.com/office/drawing/2014/chartex" xmlns:cx1="http://schemas.microsoft.com/office/drawing/2015/9/8/chartex" xmlns:cx2="http://schemas.microsoft.com/office/drawing/2015/10/21/chartex" xmlns:cx3="http://schemas.microsoft.com/office/drawing/2016/5/9/chartex" xmlns:cx4="http://schemas.microsoft.com/office/drawing/2016/5/10/chartex" xmlns:cx5="http://schemas.microsoft.com/office/drawing/2016/5/11/chartex" xmlns:cx6="http://schemas.microsoft.com/office/drawing/2016/5/12/chartex" xmlns:cx7="http://schemas.microsoft.com/office/drawing/2016/5/13/chartex" xmlns:cx8="http://schemas.microsoft.com/office/drawing/2016/5/14/chartex" xmlns:mc="http://schemas.openxmlformats.org/markup-compatibility/2006" xmlns:aink="http://schemas.microsoft.com/office/drawing/2016/ink" xmlns:am3d="http://schemas.microsoft.com/office/drawing/2017/model3d" xmlns:o="urn:schemas-microsoft-com:office:office" xmlns:oel="http://schemas.microsoft.com/office/2019/extlst" xmlns:r="http://schemas.openxmlformats.org/officeDocument/2006/relationships" xmlns:m="http://schemas.openxmlformats.org/officeDocument/2006/math" xmlns:v="urn:schemas-microsoft-com:vml" xmlns:wp14="http://schemas.microsoft.com/office/word/2010/wordprocessingDrawing" xmlns:wp="http://schemas.openxmlformats.org/drawingml/2006/wordprocessingDrawing" xmlns:w10="urn:schemas-microsoft-com:office:word" xmlns:w="http://schemas.openxmlformats.org/wordprocessingml/2006/main" xmlns:w14="http://schemas.microsoft.com/office/word/2010/wordml" xmlns:w15="http://schemas.microsoft.com/office/word/2012/wordml" xmlns:w16cex="http://schemas.microsoft.com/office/word/2018/wordml/cex" xmlns:w16cid="http://schemas.microsoft.com/office/word/2016/wordml/cid" xmlns:w16="http://schemas.microsoft.com/office/word/2018/wordml" xmlns:w16du="http://schemas.microsoft.com/office/word/2023/wordml/word16du" xmlns:w16sdtdh="http://schemas.microsoft.com/office/word/2020/wordml/sdtdatahash" xmlns:w16sdtfl="http://schemas.microsoft.com/office/word/2024/wordml/sdtformatlock" xmlns:w16se="http://schemas.microsoft.com/office/word/2015/wordml/symex" xmlns:wpg="http://schemas.microsoft.com/office/word/2010/wordprocessingGroup" xmlns:wpi="http://schemas.microsoft.com/office/word/2010/wordprocessingInk" xmlns:wne="http://schemas.microsoft.com/office/word/2006/wordml" xmlns:wps="http://schemas.microsoft.com/office/word/2010/wordprocessingShape" mc:Ignorable="w14 w15 w16se w16cid w16 w16cex w16sdtdh w16sdtfl w16du wp14">
+<w:document xmlns:wpc="http://schemas.microsoft.com/office/word/2010/wordprocessingCanvas" xmlns:cx="http://schemas.microsoft.com/office/drawing/2014/chartex" xmlns:cx1="http://schemas.microsoft.com/office/drawing/2015/9/8/chartex" xmlns:cx2="http://schemas.microsoft.com/office/drawing/2015/10/21/chartex" xmlns:cx3="http://schemas.microsoft.com/office/drawing/2016/5/9/chartex" xmlns:cx4="http://schemas.microsoft.com/office/drawing/2016/5/10/chartex" xmlns:cx5="http://schemas.microsoft.com/office/drawing/2016/5/11/chartex" xmlns:cx6="http://schemas.microsoft.com/office/drawing/2016/5/12/chartex" xmlns:cx7="http://schemas.microsoft.com/office/drawing/2016/5/13/chartex" xmlns:cx8="http://schemas.microsoft.com/office/drawing/2016/5/14/chartex" xmlns:mc="http://schemas.openxmlformats.org/markup-compatibility/2006" xmlns:aink="http://schemas.microsoft.com/office/drawing/2016/ink" xmlns:am3d="http://schemas.microsoft.com/office/drawing/2017/model3d" xmlns:o="urn:schemas-microsoft-com:office:office" xmlns:r="http://schemas.openxmlformats.org/officeDocument/2006/relationships" xmlns:m="http://schemas.openxmlformats.org/officeDocument/2006/math" xmlns:v="urn:schemas-microsoft-com:vml" xmlns:wp14="http://schemas.microsoft.com/office/word/2010/wordprocessingDrawing" xmlns:wp="http://schemas.openxmlformats.org/drawingml/2006/wordprocessingDrawing" xmlns:w10="urn:schemas-microsoft-com:office:word" xmlns:w="http://schemas.openxmlformats.org/wordprocessingml/2006/main" xmlns:w14="http://schemas.microsoft.com/office/word/2010/wordml" xmlns:w15="http://schemas.microsoft.com/office/word/2012/wordml" xmlns:w16cex="http://schemas.microsoft.com/office/word/2018/wordml/cex" xmlns:w16cid="http://schemas.microsoft.com/office/word/2016/wordml/cid" xmlns:w16="http://schemas.microsoft.com/office/word/2018/wordml" xmlns:w16sdtdh="http://schemas.microsoft.com/office/word/2020/wordml/sdtdatahash" xmlns:w16se="http://schemas.microsoft.com/office/word/2015/wordml/symex" xmlns:wpg="http://schemas.microsoft.com/office/word/2010/wordprocessingGroup" xmlns:wpi="http://schemas.microsoft.com/office/word/2010/wordprocessingInk" xmlns:wne="http://schemas.microsoft.com/office/word/2006/wordml" xmlns:wps="http://schemas.microsoft.com/office/word/2010/wordprocessingShape" mc:Ignorable="w14 w15 w16se w16cid w16 w16cex w16sdtdh wp14">
   <w:body>
     <w:p>
       <w:pPr>
@@ -23,59 +23,13 @@
         </w:rPr>
         <w:t>Цель</w:t>
       </w:r>
-      <w:proofErr w:type="gramStart"/>
-      <w:r>
-        <w:rPr>
-          <w:rFonts w:ascii="Times New Roman" w:hAnsi="Times New Roman" w:cs="Times New Roman"/>
-          <w:sz w:val="28"/>
-          <w:szCs w:val="28"/>
-        </w:rPr>
-        <w:t>: Разработать</w:t>
-      </w:r>
-      <w:proofErr w:type="gramEnd"/>
-      <w:r>
-        <w:rPr>
-          <w:rFonts w:ascii="Times New Roman" w:hAnsi="Times New Roman" w:cs="Times New Roman"/>
-          <w:sz w:val="28"/>
-          <w:szCs w:val="28"/>
-        </w:rPr>
-        <w:t xml:space="preserve"> полнофункциональное веб-приложение на Python с использованием </w:t>
-      </w:r>
-      <w:proofErr w:type="spellStart"/>
-      <w:r>
-        <w:rPr>
-          <w:rFonts w:ascii="Times New Roman" w:hAnsi="Times New Roman" w:cs="Times New Roman"/>
-          <w:sz w:val="28"/>
-          <w:szCs w:val="28"/>
-        </w:rPr>
-        <w:t>микрофреймворка</w:t>
-      </w:r>
-      <w:proofErr w:type="spellEnd"/>
-      <w:r>
-        <w:rPr>
-          <w:rFonts w:ascii="Times New Roman" w:hAnsi="Times New Roman" w:cs="Times New Roman"/>
-          <w:sz w:val="28"/>
-          <w:szCs w:val="28"/>
-        </w:rPr>
-        <w:t xml:space="preserve"> </w:t>
-      </w:r>
-      <w:proofErr w:type="spellStart"/>
-      <w:r>
-        <w:rPr>
-          <w:rFonts w:ascii="Times New Roman" w:hAnsi="Times New Roman" w:cs="Times New Roman"/>
-          <w:sz w:val="28"/>
-          <w:szCs w:val="28"/>
-        </w:rPr>
-        <w:t>Flask</w:t>
-      </w:r>
-      <w:proofErr w:type="spellEnd"/>
-      <w:r>
-        <w:rPr>
-          <w:rFonts w:ascii="Times New Roman" w:hAnsi="Times New Roman" w:cs="Times New Roman"/>
-          <w:sz w:val="28"/>
-          <w:szCs w:val="28"/>
-        </w:rPr>
-        <w:t>, реализующее REST API для выбранной предметной области, с применением современных практик проектирования, тестирования, контейнеризации, документирования и последующим развёртыванием на</w:t>
+      <w:r>
+        <w:rPr>
+          <w:rFonts w:ascii="Times New Roman" w:hAnsi="Times New Roman" w:cs="Times New Roman"/>
+          <w:sz w:val="28"/>
+          <w:szCs w:val="28"/>
+        </w:rPr>
+        <w:t>: Разработать полнофункциональное веб-приложение на Python с использованием микрофреймворка Flask, реализующее REST API для выбранной предметной области, с применением современных практик проектирования, тестирования, контейнеризации, документирования и последующим развёртыванием на</w:t>
       </w:r>
       <w:r>
         <w:rPr>
@@ -103,23 +57,13 @@
         </w:rPr>
         <w:t> </w:t>
       </w:r>
-      <w:proofErr w:type="spellStart"/>
-      <w:r>
-        <w:rPr>
-          <w:rFonts w:ascii="Times New Roman" w:hAnsi="Times New Roman" w:cs="Times New Roman"/>
-          <w:sz w:val="28"/>
-          <w:szCs w:val="28"/>
-        </w:rPr>
-        <w:t>PythonAnywhere</w:t>
-      </w:r>
-      <w:proofErr w:type="spellEnd"/>
-      <w:r>
-        <w:rPr>
-          <w:rFonts w:ascii="Times New Roman" w:hAnsi="Times New Roman" w:cs="Times New Roman"/>
-          <w:sz w:val="28"/>
-          <w:szCs w:val="28"/>
-        </w:rPr>
-        <w:t>.</w:t>
+      <w:r>
+        <w:rPr>
+          <w:rFonts w:ascii="Times New Roman" w:hAnsi="Times New Roman" w:cs="Times New Roman"/>
+          <w:sz w:val="28"/>
+          <w:szCs w:val="28"/>
+        </w:rPr>
+        <w:t>PythonAnywhere.</w:t>
       </w:r>
     </w:p>
     <w:p>
@@ -291,7 +235,6 @@
         </w:rPr>
         <w:t xml:space="preserve">диаграммы в </w:t>
       </w:r>
-      <w:proofErr w:type="spellStart"/>
       <w:r>
         <w:rPr>
           <w:rFonts w:ascii="Times New Roman" w:hAnsi="Times New Roman" w:cs="Times New Roman"/>
@@ -301,7 +244,6 @@
         </w:rPr>
         <w:t>MySQl</w:t>
       </w:r>
-      <w:proofErr w:type="spellEnd"/>
       <w:r>
         <w:rPr>
           <w:rFonts w:ascii="Times New Roman" w:hAnsi="Times New Roman" w:cs="Times New Roman"/>
@@ -359,19 +301,21 @@
           <w:sz w:val="28"/>
           <w:szCs w:val="28"/>
         </w:rPr>
-        <w:t>Настроить проверку входящих JSON-данных (например, через </w:t>
-      </w:r>
-      <w:proofErr w:type="spellStart"/>
-      <w:r>
+        <w:t>Настроить проверку входящих JSON-данных (например, через Marshmallow или Pydantic), чтобы приложение не «падало» при неверном вводе, а выдавало понятную ошибку (400 Bad Request).</w:t>
+      </w:r>
+    </w:p>
+    <w:p>
+      <w:pPr>
+        <w:spacing w:after="0" w:line="360" w:lineRule="auto"/>
+        <w:ind w:firstLine="709"/>
+        <w:jc w:val="both"/>
         <w:rPr>
           <w:rFonts w:ascii="Times New Roman" w:hAnsi="Times New Roman" w:cs="Times New Roman"/>
           <w:color w:val="EE0000"/>
           <w:sz w:val="28"/>
           <w:szCs w:val="28"/>
         </w:rPr>
-        <w:t>Marshmallow</w:t>
-      </w:r>
-      <w:proofErr w:type="spellEnd"/>
+      </w:pPr>
       <w:r>
         <w:rPr>
           <w:rFonts w:ascii="Times New Roman" w:hAnsi="Times New Roman" w:cs="Times New Roman"/>
@@ -379,9 +323,8 @@
           <w:sz w:val="28"/>
           <w:szCs w:val="28"/>
         </w:rPr>
-        <w:t> или </w:t>
-      </w:r>
-      <w:proofErr w:type="spellStart"/>
+        <w:t xml:space="preserve">5. </w:t>
+      </w:r>
       <w:r>
         <w:rPr>
           <w:rFonts w:ascii="Times New Roman" w:hAnsi="Times New Roman" w:cs="Times New Roman"/>
@@ -389,220 +332,117 @@
           <w:sz w:val="28"/>
           <w:szCs w:val="28"/>
         </w:rPr>
-        <w:t>Pydantic</w:t>
-      </w:r>
-      <w:proofErr w:type="spellEnd"/>
-      <w:r>
-        <w:rPr>
-          <w:rFonts w:ascii="Times New Roman" w:hAnsi="Times New Roman" w:cs="Times New Roman"/>
-          <w:color w:val="EE0000"/>
-          <w:sz w:val="28"/>
-          <w:szCs w:val="28"/>
-        </w:rPr>
-        <w:t xml:space="preserve">), чтобы приложение не «падало» при неверном вводе, а выдавало понятную ошибку (400 </w:t>
-      </w:r>
-      <w:proofErr w:type="spellStart"/>
-      <w:r>
-        <w:rPr>
-          <w:rFonts w:ascii="Times New Roman" w:hAnsi="Times New Roman" w:cs="Times New Roman"/>
-          <w:color w:val="EE0000"/>
-          <w:sz w:val="28"/>
-          <w:szCs w:val="28"/>
-        </w:rPr>
-        <w:t>Bad</w:t>
-      </w:r>
-      <w:proofErr w:type="spellEnd"/>
-      <w:r>
-        <w:rPr>
-          <w:rFonts w:ascii="Times New Roman" w:hAnsi="Times New Roman" w:cs="Times New Roman"/>
-          <w:color w:val="EE0000"/>
+        <w:t>Написать набор тестов на pytest, которые автоматически проверяют: создается ли пользователь, работают ли CRUD-операции и выдается ли ошибка при доступе без токена.</w:t>
+      </w:r>
+    </w:p>
+    <w:p>
+      <w:pPr>
+        <w:spacing w:after="0" w:line="360" w:lineRule="auto"/>
+        <w:ind w:firstLine="709"/>
+        <w:jc w:val="both"/>
+        <w:rPr>
+          <w:rFonts w:ascii="Times New Roman" w:hAnsi="Times New Roman" w:cs="Times New Roman"/>
+          <w:sz w:val="28"/>
+          <w:szCs w:val="28"/>
+        </w:rPr>
+      </w:pPr>
+      <w:r>
+        <w:rPr>
+          <w:rFonts w:ascii="Times New Roman" w:hAnsi="Times New Roman" w:cs="Times New Roman"/>
+          <w:sz w:val="28"/>
+          <w:szCs w:val="28"/>
+        </w:rPr>
+        <w:t xml:space="preserve">6. </w:t>
+      </w:r>
+      <w:r>
+        <w:rPr>
+          <w:rFonts w:ascii="Times New Roman" w:hAnsi="Times New Roman" w:cs="Times New Roman"/>
+          <w:sz w:val="28"/>
+          <w:szCs w:val="28"/>
+        </w:rPr>
+        <w:t>Настроить запись действий приложения в файл (логи), чтобы видеть, кто заходил в систему и какие ошибки возникали в процессе работы.</w:t>
+      </w:r>
+    </w:p>
+    <w:p>
+      <w:pPr>
+        <w:spacing w:after="0" w:line="360" w:lineRule="auto"/>
+        <w:ind w:firstLine="709"/>
+        <w:jc w:val="both"/>
+        <w:rPr>
+          <w:rFonts w:ascii="Times New Roman" w:hAnsi="Times New Roman" w:cs="Times New Roman"/>
+          <w:sz w:val="28"/>
+          <w:szCs w:val="28"/>
+        </w:rPr>
+      </w:pPr>
+      <w:r>
+        <w:rPr>
+          <w:rFonts w:ascii="Times New Roman" w:hAnsi="Times New Roman" w:cs="Times New Roman"/>
+          <w:sz w:val="28"/>
+          <w:szCs w:val="28"/>
+        </w:rPr>
+        <w:t xml:space="preserve">7. </w:t>
+      </w:r>
+      <w:r>
+        <w:rPr>
+          <w:rFonts w:ascii="Times New Roman" w:hAnsi="Times New Roman" w:cs="Times New Roman"/>
+          <w:sz w:val="28"/>
+          <w:szCs w:val="28"/>
+        </w:rPr>
+        <w:t xml:space="preserve">Сделайте хостинг на </w:t>
+      </w:r>
+      <w:r>
+        <w:rPr>
+          <w:rFonts w:ascii="Times New Roman" w:hAnsi="Times New Roman" w:cs="Times New Roman"/>
+          <w:sz w:val="28"/>
+          <w:szCs w:val="28"/>
+        </w:rPr>
+        <w:t>PythonAnywhere</w:t>
+      </w:r>
+      <w:r>
+        <w:rPr>
+          <w:rFonts w:ascii="Times New Roman" w:hAnsi="Times New Roman" w:cs="Times New Roman"/>
+          <w:sz w:val="28"/>
+          <w:szCs w:val="28"/>
+        </w:rPr>
+        <w:t>.</w:t>
+      </w:r>
+    </w:p>
+    <w:p>
+      <w:pPr>
+        <w:spacing w:after="0" w:line="360" w:lineRule="auto"/>
+        <w:ind w:firstLine="709"/>
+        <w:jc w:val="both"/>
+        <w:rPr>
+          <w:rFonts w:ascii="Times New Roman" w:hAnsi="Times New Roman" w:cs="Times New Roman"/>
+          <w:sz w:val="28"/>
+          <w:szCs w:val="28"/>
+        </w:rPr>
+      </w:pPr>
+      <w:r>
+        <w:rPr>
+          <w:rFonts w:ascii="Times New Roman" w:hAnsi="Times New Roman" w:cs="Times New Roman"/>
+          <w:sz w:val="28"/>
+          <w:szCs w:val="28"/>
+        </w:rPr>
+        <w:t xml:space="preserve">8. Сделать несколько версий в </w:t>
+      </w:r>
+      <w:r>
+        <w:rPr>
+          <w:rFonts w:ascii="Times New Roman" w:hAnsi="Times New Roman" w:cs="Times New Roman"/>
+          <w:sz w:val="28"/>
+          <w:szCs w:val="28"/>
+          <w:lang w:val="en-US"/>
+        </w:rPr>
+        <w:t>GIT</w:t>
+      </w:r>
+      <w:r>
+        <w:rPr>
+          <w:rFonts w:ascii="Times New Roman" w:hAnsi="Times New Roman" w:cs="Times New Roman"/>
           <w:sz w:val="28"/>
           <w:szCs w:val="28"/>
         </w:rPr>
         <w:t xml:space="preserve"> </w:t>
       </w:r>
-      <w:proofErr w:type="spellStart"/>
-      <w:r>
-        <w:rPr>
-          <w:rFonts w:ascii="Times New Roman" w:hAnsi="Times New Roman" w:cs="Times New Roman"/>
-          <w:color w:val="EE0000"/>
-          <w:sz w:val="28"/>
-          <w:szCs w:val="28"/>
-        </w:rPr>
-        <w:t>Request</w:t>
-      </w:r>
-      <w:proofErr w:type="spellEnd"/>
-      <w:r>
-        <w:rPr>
-          <w:rFonts w:ascii="Times New Roman" w:hAnsi="Times New Roman" w:cs="Times New Roman"/>
-          <w:color w:val="EE0000"/>
-          <w:sz w:val="28"/>
-          <w:szCs w:val="28"/>
-        </w:rPr>
-        <w:t>).</w:t>
-      </w:r>
-    </w:p>
-    <w:p>
-      <w:pPr>
-        <w:spacing w:after="0" w:line="360" w:lineRule="auto"/>
-        <w:ind w:firstLine="709"/>
-        <w:jc w:val="both"/>
-        <w:rPr>
-          <w:rFonts w:ascii="Times New Roman" w:hAnsi="Times New Roman" w:cs="Times New Roman"/>
-          <w:color w:val="EE0000"/>
-          <w:sz w:val="28"/>
-          <w:szCs w:val="28"/>
-        </w:rPr>
-      </w:pPr>
-      <w:r>
-        <w:rPr>
-          <w:rFonts w:ascii="Times New Roman" w:hAnsi="Times New Roman" w:cs="Times New Roman"/>
-          <w:color w:val="EE0000"/>
-          <w:sz w:val="28"/>
-          <w:szCs w:val="28"/>
-        </w:rPr>
-        <w:t xml:space="preserve">5. </w:t>
-      </w:r>
-      <w:r>
-        <w:rPr>
-          <w:rFonts w:ascii="Times New Roman" w:hAnsi="Times New Roman" w:cs="Times New Roman"/>
-          <w:color w:val="EE0000"/>
-          <w:sz w:val="28"/>
-          <w:szCs w:val="28"/>
-        </w:rPr>
-        <w:t>Написать набор тестов на </w:t>
-      </w:r>
-      <w:proofErr w:type="spellStart"/>
-      <w:r>
-        <w:rPr>
-          <w:rFonts w:ascii="Times New Roman" w:hAnsi="Times New Roman" w:cs="Times New Roman"/>
-          <w:color w:val="EE0000"/>
-          <w:sz w:val="28"/>
-          <w:szCs w:val="28"/>
-        </w:rPr>
-        <w:t>pytest</w:t>
-      </w:r>
-      <w:proofErr w:type="spellEnd"/>
-      <w:r>
-        <w:rPr>
-          <w:rFonts w:ascii="Times New Roman" w:hAnsi="Times New Roman" w:cs="Times New Roman"/>
-          <w:color w:val="EE0000"/>
-          <w:sz w:val="28"/>
-          <w:szCs w:val="28"/>
-        </w:rPr>
-        <w:t>, которые автоматически проверяют: создается ли пользователь, работают ли CRUD-операции и выдается ли ошибка при доступе без токена.</w:t>
-      </w:r>
-    </w:p>
-    <w:p>
-      <w:pPr>
-        <w:spacing w:after="0" w:line="360" w:lineRule="auto"/>
-        <w:ind w:firstLine="709"/>
-        <w:jc w:val="both"/>
-        <w:rPr>
-          <w:rFonts w:ascii="Times New Roman" w:hAnsi="Times New Roman" w:cs="Times New Roman"/>
-          <w:sz w:val="28"/>
-          <w:szCs w:val="28"/>
-        </w:rPr>
-      </w:pPr>
-      <w:r>
-        <w:rPr>
-          <w:rFonts w:ascii="Times New Roman" w:hAnsi="Times New Roman" w:cs="Times New Roman"/>
-          <w:sz w:val="28"/>
-          <w:szCs w:val="28"/>
-        </w:rPr>
-        <w:t xml:space="preserve">6. </w:t>
-      </w:r>
-      <w:r>
-        <w:rPr>
-          <w:rFonts w:ascii="Times New Roman" w:hAnsi="Times New Roman" w:cs="Times New Roman"/>
-          <w:sz w:val="28"/>
-          <w:szCs w:val="28"/>
-        </w:rPr>
-        <w:t>Настроить запись действий приложения в файл (логи), чтобы видеть, кто заходил в систему и какие ошибки возникали в процессе работы.</w:t>
-      </w:r>
-    </w:p>
-    <w:p>
-      <w:pPr>
-        <w:spacing w:after="0" w:line="360" w:lineRule="auto"/>
-        <w:ind w:firstLine="709"/>
-        <w:jc w:val="both"/>
-        <w:rPr>
-          <w:rFonts w:ascii="Times New Roman" w:hAnsi="Times New Roman" w:cs="Times New Roman"/>
-          <w:sz w:val="28"/>
-          <w:szCs w:val="28"/>
-        </w:rPr>
-      </w:pPr>
-      <w:r>
-        <w:rPr>
-          <w:rFonts w:ascii="Times New Roman" w:hAnsi="Times New Roman" w:cs="Times New Roman"/>
-          <w:sz w:val="28"/>
-          <w:szCs w:val="28"/>
-        </w:rPr>
-        <w:t xml:space="preserve">7. </w:t>
-      </w:r>
-      <w:r>
-        <w:rPr>
-          <w:rFonts w:ascii="Times New Roman" w:hAnsi="Times New Roman" w:cs="Times New Roman"/>
-          <w:sz w:val="28"/>
-          <w:szCs w:val="28"/>
-        </w:rPr>
-        <w:t xml:space="preserve">Сделайте хостинг на </w:t>
-      </w:r>
-      <w:proofErr w:type="spellStart"/>
-      <w:r>
-        <w:rPr>
-          <w:rFonts w:ascii="Times New Roman" w:hAnsi="Times New Roman" w:cs="Times New Roman"/>
-          <w:sz w:val="28"/>
-          <w:szCs w:val="28"/>
-        </w:rPr>
-        <w:t>PythonAnywhere</w:t>
-      </w:r>
-      <w:proofErr w:type="spellEnd"/>
-      <w:r>
-        <w:rPr>
-          <w:rFonts w:ascii="Times New Roman" w:hAnsi="Times New Roman" w:cs="Times New Roman"/>
-          <w:sz w:val="28"/>
-          <w:szCs w:val="28"/>
-        </w:rPr>
-        <w:t>.</w:t>
-      </w:r>
-    </w:p>
-    <w:p>
-      <w:pPr>
-        <w:spacing w:after="0" w:line="360" w:lineRule="auto"/>
-        <w:ind w:firstLine="709"/>
-        <w:jc w:val="both"/>
-        <w:rPr>
-          <w:rFonts w:ascii="Times New Roman" w:hAnsi="Times New Roman" w:cs="Times New Roman"/>
-          <w:sz w:val="28"/>
-          <w:szCs w:val="28"/>
-        </w:rPr>
-      </w:pPr>
-      <w:r>
-        <w:rPr>
-          <w:rFonts w:ascii="Times New Roman" w:hAnsi="Times New Roman" w:cs="Times New Roman"/>
-          <w:sz w:val="28"/>
-          <w:szCs w:val="28"/>
-        </w:rPr>
-        <w:t xml:space="preserve">8. Сделать несколько версий в </w:t>
-      </w:r>
-      <w:r>
-        <w:rPr>
-          <w:rFonts w:ascii="Times New Roman" w:hAnsi="Times New Roman" w:cs="Times New Roman"/>
-          <w:sz w:val="28"/>
-          <w:szCs w:val="28"/>
-          <w:lang w:val="en-US"/>
-        </w:rPr>
-        <w:t>GIT</w:t>
-      </w:r>
-      <w:r>
-        <w:rPr>
-          <w:rFonts w:ascii="Times New Roman" w:hAnsi="Times New Roman" w:cs="Times New Roman"/>
-          <w:sz w:val="28"/>
-          <w:szCs w:val="28"/>
-        </w:rPr>
-        <w:t xml:space="preserve"> </w:t>
-      </w:r>
     </w:p>
     <w:p>
       <w:pPr>
@@ -629,7 +469,23 @@
           <w:sz w:val="28"/>
           <w:szCs w:val="28"/>
         </w:rPr>
-        <w:t>. Создать руководство пользователя с примерами и скриншотами.</w:t>
+        <w:t xml:space="preserve">. Создать </w:t>
+      </w:r>
+      <w:r>
+        <w:rPr>
+          <w:rFonts w:ascii="Times New Roman" w:hAnsi="Times New Roman" w:cs="Times New Roman"/>
+          <w:sz w:val="28"/>
+          <w:szCs w:val="28"/>
+        </w:rPr>
+        <w:t>отчет</w:t>
+      </w:r>
+      <w:r>
+        <w:rPr>
+          <w:rFonts w:ascii="Times New Roman" w:hAnsi="Times New Roman" w:cs="Times New Roman"/>
+          <w:sz w:val="28"/>
+          <w:szCs w:val="28"/>
+        </w:rPr>
+        <w:t xml:space="preserve"> с примерами и скриншотами.</w:t>
       </w:r>
     </w:p>
     <w:p>
@@ -1144,61 +1000,7 @@
           <w:sz w:val="28"/>
           <w:szCs w:val="28"/>
         </w:rPr>
-        <w:t xml:space="preserve"> – обмен сообщениями (</w:t>
-      </w:r>
-      <w:proofErr w:type="spellStart"/>
-      <w:r>
-        <w:rPr>
-          <w:rFonts w:ascii="Times New Roman" w:hAnsi="Times New Roman" w:cs="Times New Roman"/>
-          <w:sz w:val="28"/>
-          <w:szCs w:val="28"/>
-        </w:rPr>
-        <w:t>WebSocket</w:t>
-      </w:r>
-      <w:proofErr w:type="spellEnd"/>
-      <w:r>
-        <w:rPr>
-          <w:rFonts w:ascii="Times New Roman" w:hAnsi="Times New Roman" w:cs="Times New Roman"/>
-          <w:sz w:val="28"/>
-          <w:szCs w:val="28"/>
-        </w:rPr>
-        <w:t xml:space="preserve"> или </w:t>
-      </w:r>
-      <w:proofErr w:type="spellStart"/>
-      <w:r>
-        <w:rPr>
-          <w:rFonts w:ascii="Times New Roman" w:hAnsi="Times New Roman" w:cs="Times New Roman"/>
-          <w:sz w:val="28"/>
-          <w:szCs w:val="28"/>
-        </w:rPr>
-        <w:t>long</w:t>
-      </w:r>
-      <w:proofErr w:type="spellEnd"/>
-      <w:r>
-        <w:rPr>
-          <w:rFonts w:ascii="Times New Roman" w:hAnsi="Times New Roman" w:cs="Times New Roman"/>
-          <w:sz w:val="28"/>
-          <w:szCs w:val="28"/>
-        </w:rPr>
-        <w:t xml:space="preserve"> </w:t>
-      </w:r>
-      <w:proofErr w:type="spellStart"/>
-      <w:r>
-        <w:rPr>
-          <w:rFonts w:ascii="Times New Roman" w:hAnsi="Times New Roman" w:cs="Times New Roman"/>
-          <w:sz w:val="28"/>
-          <w:szCs w:val="28"/>
-        </w:rPr>
-        <w:t>polling</w:t>
-      </w:r>
-      <w:proofErr w:type="spellEnd"/>
-      <w:r>
-        <w:rPr>
-          <w:rFonts w:ascii="Times New Roman" w:hAnsi="Times New Roman" w:cs="Times New Roman"/>
-          <w:sz w:val="28"/>
-          <w:szCs w:val="28"/>
-        </w:rPr>
-        <w:t xml:space="preserve">), комнаты. </w:t>
+        <w:t xml:space="preserve"> – обмен сообщениями (WebSocket или long polling), комнаты. </w:t>
       </w:r>
     </w:p>
     <w:p>
@@ -1274,43 +1076,7 @@
           <w:sz w:val="28"/>
           <w:szCs w:val="28"/>
         </w:rPr>
-        <w:t xml:space="preserve"> (</w:t>
-      </w:r>
-      <w:proofErr w:type="spellStart"/>
-      <w:r>
-        <w:rPr>
-          <w:rFonts w:ascii="Times New Roman" w:hAnsi="Times New Roman" w:cs="Times New Roman"/>
-          <w:sz w:val="28"/>
-          <w:szCs w:val="28"/>
-        </w:rPr>
-        <w:t>Kanban</w:t>
-      </w:r>
-      <w:proofErr w:type="spellEnd"/>
-      <w:r>
-        <w:rPr>
-          <w:rFonts w:ascii="Times New Roman" w:hAnsi="Times New Roman" w:cs="Times New Roman"/>
-          <w:sz w:val="28"/>
-          <w:szCs w:val="28"/>
-        </w:rPr>
-        <w:t xml:space="preserve">) – колонки, карточки, перемещение (аналог </w:t>
-      </w:r>
-      <w:proofErr w:type="spellStart"/>
-      <w:r>
-        <w:rPr>
-          <w:rFonts w:ascii="Times New Roman" w:hAnsi="Times New Roman" w:cs="Times New Roman"/>
-          <w:sz w:val="28"/>
-          <w:szCs w:val="28"/>
-        </w:rPr>
-        <w:t>Trello</w:t>
-      </w:r>
-      <w:proofErr w:type="spellEnd"/>
-      <w:r>
-        <w:rPr>
-          <w:rFonts w:ascii="Times New Roman" w:hAnsi="Times New Roman" w:cs="Times New Roman"/>
-          <w:sz w:val="28"/>
-          <w:szCs w:val="28"/>
-        </w:rPr>
-        <w:t xml:space="preserve">). </w:t>
+        <w:t xml:space="preserve"> (Kanban) – колонки, карточки, перемещение (аналог Trello). </w:t>
       </w:r>
     </w:p>
     <w:p>
@@ -1514,7 +1280,7 @@
 </file>
 
 <file path=word/endnotes.xml><?xml version="1.0" encoding="utf-8"?>
-<w:endnotes xmlns:wpc="http://schemas.microsoft.com/office/word/2010/wordprocessingCanvas" xmlns:cx="http://schemas.microsoft.com/office/drawing/2014/chartex" xmlns:cx1="http://schemas.microsoft.com/office/drawing/2015/9/8/chartex" xmlns:cx2="http://schemas.microsoft.com/office/drawing/2015/10/21/chartex" xmlns:cx3="http://schemas.microsoft.com/office/drawing/2016/5/9/chartex" xmlns:cx4="http://schemas.microsoft.com/office/drawing/2016/5/10/chartex" xmlns:cx5="http://schemas.microsoft.com/office/drawing/2016/5/11/chartex" xmlns:cx6="http://schemas.microsoft.com/office/drawing/2016/5/12/chartex" xmlns:cx7="http://schemas.microsoft.com/office/drawing/2016/5/13/chartex" xmlns:cx8="http://schemas.microsoft.com/office/drawing/2016/5/14/chartex" xmlns:mc="http://schemas.openxmlformats.org/markup-compatibility/2006" xmlns:aink="http://schemas.microsoft.com/office/drawing/2016/ink" xmlns:am3d="http://schemas.microsoft.com/office/drawing/2017/model3d" xmlns:o="urn:schemas-microsoft-com:office:office" xmlns:oel="http://schemas.microsoft.com/office/2019/extlst" xmlns:r="http://schemas.openxmlformats.org/officeDocument/2006/relationships" xmlns:m="http://schemas.openxmlformats.org/officeDocument/2006/math" xmlns:v="urn:schemas-microsoft-com:vml" xmlns:wp14="http://schemas.microsoft.com/office/word/2010/wordprocessingDrawing" xmlns:wp="http://schemas.openxmlformats.org/drawingml/2006/wordprocessingDrawing" xmlns:w10="urn:schemas-microsoft-com:office:word" xmlns:w="http://schemas.openxmlformats.org/wordprocessingml/2006/main" xmlns:w14="http://schemas.microsoft.com/office/word/2010/wordml" xmlns:w15="http://schemas.microsoft.com/office/word/2012/wordml" xmlns:w16cex="http://schemas.microsoft.com/office/word/2018/wordml/cex" xmlns:w16cid="http://schemas.microsoft.com/office/word/2016/wordml/cid" xmlns:w16="http://schemas.microsoft.com/office/word/2018/wordml" xmlns:w16du="http://schemas.microsoft.com/office/word/2023/wordml/word16du" xmlns:w16sdtdh="http://schemas.microsoft.com/office/word/2020/wordml/sdtdatahash" xmlns:w16sdtfl="http://schemas.microsoft.com/office/word/2024/wordml/sdtformatlock" xmlns:w16se="http://schemas.microsoft.com/office/word/2015/wordml/symex" xmlns:wpg="http://schemas.microsoft.com/office/word/2010/wordprocessingGroup" xmlns:wpi="http://schemas.microsoft.com/office/word/2010/wordprocessingInk" xmlns:wne="http://schemas.microsoft.com/office/word/2006/wordml" xmlns:wps="http://schemas.microsoft.com/office/word/2010/wordprocessingShape" mc:Ignorable="w14 w15 w16se w16cid w16 w16cex w16sdtdh w16sdtfl w16du wp14">
+<w:endnotes xmlns:wpc="http://schemas.microsoft.com/office/word/2010/wordprocessingCanvas" xmlns:cx="http://schemas.microsoft.com/office/drawing/2014/chartex" xmlns:cx1="http://schemas.microsoft.com/office/drawing/2015/9/8/chartex" xmlns:cx2="http://schemas.microsoft.com/office/drawing/2015/10/21/chartex" xmlns:cx3="http://schemas.microsoft.com/office/drawing/2016/5/9/chartex" xmlns:cx4="http://schemas.microsoft.com/office/drawing/2016/5/10/chartex" xmlns:cx5="http://schemas.microsoft.com/office/drawing/2016/5/11/chartex" xmlns:cx6="http://schemas.microsoft.com/office/drawing/2016/5/12/chartex" xmlns:cx7="http://schemas.microsoft.com/office/drawing/2016/5/13/chartex" xmlns:cx8="http://schemas.microsoft.com/office/drawing/2016/5/14/chartex" xmlns:mc="http://schemas.openxmlformats.org/markup-compatibility/2006" xmlns:aink="http://schemas.microsoft.com/office/drawing/2016/ink" xmlns:am3d="http://schemas.microsoft.com/office/drawing/2017/model3d" xmlns:o="urn:schemas-microsoft-com:office:office" xmlns:r="http://schemas.openxmlformats.org/officeDocument/2006/relationships" xmlns:m="http://schemas.openxmlformats.org/officeDocument/2006/math" xmlns:v="urn:schemas-microsoft-com:vml" xmlns:wp14="http://schemas.microsoft.com/office/word/2010/wordprocessingDrawing" xmlns:wp="http://schemas.openxmlformats.org/drawingml/2006/wordprocessingDrawing" xmlns:w10="urn:schemas-microsoft-com:office:word" xmlns:w="http://schemas.openxmlformats.org/wordprocessingml/2006/main" xmlns:w14="http://schemas.microsoft.com/office/word/2010/wordml" xmlns:w15="http://schemas.microsoft.com/office/word/2012/wordml" xmlns:w16cex="http://schemas.microsoft.com/office/word/2018/wordml/cex" xmlns:w16cid="http://schemas.microsoft.com/office/word/2016/wordml/cid" xmlns:w16="http://schemas.microsoft.com/office/word/2018/wordml" xmlns:w16sdtdh="http://schemas.microsoft.com/office/word/2020/wordml/sdtdatahash" xmlns:w16se="http://schemas.microsoft.com/office/word/2015/wordml/symex" xmlns:wpg="http://schemas.microsoft.com/office/word/2010/wordprocessingGroup" xmlns:wpi="http://schemas.microsoft.com/office/word/2010/wordprocessingInk" xmlns:wne="http://schemas.microsoft.com/office/word/2006/wordml" xmlns:wps="http://schemas.microsoft.com/office/word/2010/wordprocessingShape" mc:Ignorable="w14 w15 w16se w16cid w16 w16cex w16sdtdh wp14">
   <w:endnote w:type="separator" w:id="-1">
     <w:p>
       <w:pPr>
@@ -1539,7 +1305,7 @@
 </file>
 
 <file path=word/footnotes.xml><?xml version="1.0" encoding="utf-8"?>
-<w:footnotes xmlns:wpc="http://schemas.microsoft.com/office/word/2010/wordprocessingCanvas" xmlns:cx="http://schemas.microsoft.com/office/drawing/2014/chartex" xmlns:cx1="http://schemas.microsoft.com/office/drawing/2015/9/8/chartex" xmlns:cx2="http://schemas.microsoft.com/office/drawing/2015/10/21/chartex" xmlns:cx3="http://schemas.microsoft.com/office/drawing/2016/5/9/chartex" xmlns:cx4="http://schemas.microsoft.com/office/drawing/2016/5/10/chartex" xmlns:cx5="http://schemas.microsoft.com/office/drawing/2016/5/11/chartex" xmlns:cx6="http://schemas.microsoft.com/office/drawing/2016/5/12/chartex" xmlns:cx7="http://schemas.microsoft.com/office/drawing/2016/5/13/chartex" xmlns:cx8="http://schemas.microsoft.com/office/drawing/2016/5/14/chartex" xmlns:mc="http://schemas.openxmlformats.org/markup-compatibility/2006" xmlns:aink="http://schemas.microsoft.com/office/drawing/2016/ink" xmlns:am3d="http://schemas.microsoft.com/office/drawing/2017/model3d" xmlns:o="urn:schemas-microsoft-com:office:office" xmlns:oel="http://schemas.microsoft.com/office/2019/extlst" xmlns:r="http://schemas.openxmlformats.org/officeDocument/2006/relationships" xmlns:m="http://schemas.openxmlformats.org/officeDocument/2006/math" xmlns:v="urn:schemas-microsoft-com:vml" xmlns:wp14="http://schemas.microsoft.com/office/word/2010/wordprocessingDrawing" xmlns:wp="http://schemas.openxmlformats.org/drawingml/2006/wordprocessingDrawing" xmlns:w10="urn:schemas-microsoft-com:office:word" xmlns:w="http://schemas.openxmlformats.org/wordprocessingml/2006/main" xmlns:w14="http://schemas.microsoft.com/office/word/2010/wordml" xmlns:w15="http://schemas.microsoft.com/office/word/2012/wordml" xmlns:w16cex="http://schemas.microsoft.com/office/word/2018/wordml/cex" xmlns:w16cid="http://schemas.microsoft.com/office/word/2016/wordml/cid" xmlns:w16="http://schemas.microsoft.com/office/word/2018/wordml" xmlns:w16du="http://schemas.microsoft.com/office/word/2023/wordml/word16du" xmlns:w16sdtdh="http://schemas.microsoft.com/office/word/2020/wordml/sdtdatahash" xmlns:w16sdtfl="http://schemas.microsoft.com/office/word/2024/wordml/sdtformatlock" xmlns:w16se="http://schemas.microsoft.com/office/word/2015/wordml/symex" xmlns:wpg="http://schemas.microsoft.com/office/word/2010/wordprocessingGroup" xmlns:wpi="http://schemas.microsoft.com/office/word/2010/wordprocessingInk" xmlns:wne="http://schemas.microsoft.com/office/word/2006/wordml" xmlns:wps="http://schemas.microsoft.com/office/word/2010/wordprocessingShape" mc:Ignorable="w14 w15 w16se w16cid w16 w16cex w16sdtdh w16sdtfl w16du wp14">
+<w:footnotes xmlns:wpc="http://schemas.microsoft.com/office/word/2010/wordprocessingCanvas" xmlns:cx="http://schemas.microsoft.com/office/drawing/2014/chartex" xmlns:cx1="http://schemas.microsoft.com/office/drawing/2015/9/8/chartex" xmlns:cx2="http://schemas.microsoft.com/office/drawing/2015/10/21/chartex" xmlns:cx3="http://schemas.microsoft.com/office/drawing/2016/5/9/chartex" xmlns:cx4="http://schemas.microsoft.com/office/drawing/2016/5/10/chartex" xmlns:cx5="http://schemas.microsoft.com/office/drawing/2016/5/11/chartex" xmlns:cx6="http://schemas.microsoft.com/office/drawing/2016/5/12/chartex" xmlns:cx7="http://schemas.microsoft.com/office/drawing/2016/5/13/chartex" xmlns:cx8="http://schemas.microsoft.com/office/drawing/2016/5/14/chartex" xmlns:mc="http://schemas.openxmlformats.org/markup-compatibility/2006" xmlns:aink="http://schemas.microsoft.com/office/drawing/2016/ink" xmlns:am3d="http://schemas.microsoft.com/office/drawing/2017/model3d" xmlns:o="urn:schemas-microsoft-com:office:office" xmlns:r="http://schemas.openxmlformats.org/officeDocument/2006/relationships" xmlns:m="http://schemas.openxmlformats.org/officeDocument/2006/math" xmlns:v="urn:schemas-microsoft-com:vml" xmlns:wp14="http://schemas.microsoft.com/office/word/2010/wordprocessingDrawing" xmlns:wp="http://schemas.openxmlformats.org/drawingml/2006/wordprocessingDrawing" xmlns:w10="urn:schemas-microsoft-com:office:word" xmlns:w="http://schemas.openxmlformats.org/wordprocessingml/2006/main" xmlns:w14="http://schemas.microsoft.com/office/word/2010/wordml" xmlns:w15="http://schemas.microsoft.com/office/word/2012/wordml" xmlns:w16cex="http://schemas.microsoft.com/office/word/2018/wordml/cex" xmlns:w16cid="http://schemas.microsoft.com/office/word/2016/wordml/cid" xmlns:w16="http://schemas.microsoft.com/office/word/2018/wordml" xmlns:w16sdtdh="http://schemas.microsoft.com/office/word/2020/wordml/sdtdatahash" xmlns:w16se="http://schemas.microsoft.com/office/word/2015/wordml/symex" xmlns:wpg="http://schemas.microsoft.com/office/word/2010/wordprocessingGroup" xmlns:wpi="http://schemas.microsoft.com/office/word/2010/wordprocessingInk" xmlns:wne="http://schemas.microsoft.com/office/word/2006/wordml" xmlns:wps="http://schemas.microsoft.com/office/word/2010/wordprocessingShape" mc:Ignorable="w14 w15 w16se w16cid w16 w16cex w16sdtdh wp14">
   <w:footnote w:type="separator" w:id="-1">
     <w:p>
       <w:pPr>
@@ -1564,7 +1330,7 @@
 </file>
 
 <file path=word/styles.xml><?xml version="1.0" encoding="utf-8"?>
-<w:styles xmlns:mc="http://schemas.openxmlformats.org/markup-compatibility/2006" xmlns:r="http://schemas.openxmlformats.org/officeDocument/2006/relationships" xmlns:w="http://schemas.openxmlformats.org/wordprocessingml/2006/main" xmlns:w14="http://schemas.microsoft.com/office/word/2010/wordml" xmlns:w15="http://schemas.microsoft.com/office/word/2012/wordml" xmlns:w16cex="http://schemas.microsoft.com/office/word/2018/wordml/cex" xmlns:w16cid="http://schemas.microsoft.com/office/word/2016/wordml/cid" xmlns:w16="http://schemas.microsoft.com/office/word/2018/wordml" xmlns:w16du="http://schemas.microsoft.com/office/word/2023/wordml/word16du" xmlns:w16sdtdh="http://schemas.microsoft.com/office/word/2020/wordml/sdtdatahash" xmlns:w16sdtfl="http://schemas.microsoft.com/office/word/2024/wordml/sdtformatlock" xmlns:w16se="http://schemas.microsoft.com/office/word/2015/wordml/symex" mc:Ignorable="w14 w15 w16se w16cid w16 w16cex w16sdtdh w16sdtfl w16du">
+<w:styles xmlns:mc="http://schemas.openxmlformats.org/markup-compatibility/2006" xmlns:r="http://schemas.openxmlformats.org/officeDocument/2006/relationships" xmlns:w="http://schemas.openxmlformats.org/wordprocessingml/2006/main" xmlns:w14="http://schemas.microsoft.com/office/word/2010/wordml" xmlns:w15="http://schemas.microsoft.com/office/word/2012/wordml" xmlns:w16cex="http://schemas.microsoft.com/office/word/2018/wordml/cex" xmlns:w16cid="http://schemas.microsoft.com/office/word/2016/wordml/cid" xmlns:w16="http://schemas.microsoft.com/office/word/2018/wordml" xmlns:w16sdtdh="http://schemas.microsoft.com/office/word/2020/wordml/sdtdatahash" xmlns:w16se="http://schemas.microsoft.com/office/word/2015/wordml/symex" mc:Ignorable="w14 w15 w16se w16cid w16 w16cex w16sdtdh">
   <w:docDefaults>
     <w:rPrDefault>
       <w:rPr>

</xml_diff>